<commit_message>
update Login, fix business, update staff and manager
</commit_message>
<xml_diff>
--- a/docs/Business Booking Flow.docx
+++ b/docs/Business Booking Flow.docx
@@ -41,7 +41,7 @@
           <w:pgNumType w:start="1"/>
         </w:sectPr>
       </w:pPr>
-      <w:bookmarkStart w:colFirst="0" w:colLast="0" w:name="_v37zoggu8y6y" w:id="0"/>
+      <w:bookmarkStart w:colFirst="0" w:colLast="0" w:name="_ngl7km6n0qlw" w:id="0"/>
       <w:bookmarkEnd w:id="0"/>
       <w:r>
         <w:rPr>
@@ -484,7 +484,7 @@
           <w:pgNumType w:start="1"/>
         </w:sectPr>
       </w:pPr>
-      <w:bookmarkStart w:colFirst="0" w:colLast="0" w:name="_xk0i9ngafwgr" w:id="7"/>
+      <w:bookmarkStart w:colFirst="0" w:colLast="0" w:name="_hdcsijhzeovq" w:id="7"/>
       <w:bookmarkEnd w:id="7"/>
       <w:r>
         <w:rPr>
@@ -2219,7 +2219,7 @@
           <w:pgNumType w:start="1"/>
         </w:sectPr>
       </w:pPr>
-      <w:bookmarkStart w:colFirst="0" w:colLast="0" w:name="_bsbph1drkunc" w:id="21"/>
+      <w:bookmarkStart w:colFirst="0" w:colLast="0" w:name="_jztqewsxmd5y" w:id="21"/>
       <w:bookmarkEnd w:id="21"/>
       <w:r>
         <w:rPr>
@@ -2742,7 +2742,7 @@
           <w:pgNumType w:start="1"/>
         </w:sectPr>
       </w:pPr>
-      <w:bookmarkStart w:colFirst="0" w:colLast="0" w:name="_neqksoa40oun" w:id="25"/>
+      <w:bookmarkStart w:colFirst="0" w:colLast="0" w:name="_y9x59pab6du7" w:id="25"/>
       <w:bookmarkEnd w:id="25"/>
       <w:r>
         <w:rPr>
@@ -7947,6 +7947,8 @@
           <w:rtl w:val="0"/>
         </w:rPr>
         <w:tab/>
+        <w:t xml:space="preserve"> </w:t>
+        <w:tab/>
         <w:t xml:space="preserve">Authorize: Business</w:t>
       </w:r>
       <w:r>
@@ -11354,7 +11356,7 @@
           <w:pgNumType w:start="1"/>
         </w:sectPr>
       </w:pPr>
-      <w:bookmarkStart w:colFirst="0" w:colLast="0" w:name="_yc233dfbhyid" w:id="62"/>
+      <w:bookmarkStart w:colFirst="0" w:colLast="0" w:name="_6dvblx3xz3dc" w:id="62"/>
       <w:bookmarkEnd w:id="62"/>
       <w:r>
         <w:rPr>
@@ -17000,7 +17002,7 @@
           <wp:extent cx="7781925" cy="409575"/>
           <wp:effectExtent b="0" l="0" r="0" t="0"/>
           <wp:wrapTopAndBottom distB="0" distT="0"/>
-          <wp:docPr descr="footer" id="6" name="image1.png"/>
+          <wp:docPr descr="footer" id="3" name="image1.png"/>
           <a:graphic>
             <a:graphicData uri="http://schemas.openxmlformats.org/drawingml/2006/picture">
               <pic:pic>
@@ -17592,7 +17594,7 @@
         <wp:anchor allowOverlap="1" behindDoc="0" distB="0" distT="0" distL="0" distR="0" hidden="0" layoutInCell="1" locked="0" relativeHeight="0" simplePos="0">
           <wp:simplePos x="0" y="0"/>
           <wp:positionH relativeFrom="column">
-            <wp:posOffset>-919162</wp:posOffset>
+            <wp:posOffset>-914399</wp:posOffset>
           </wp:positionH>
           <wp:positionV relativeFrom="paragraph">
             <wp:posOffset>-66674</wp:posOffset>
@@ -17634,7 +17636,7 @@
         <wp:anchor allowOverlap="1" behindDoc="0" distB="0" distT="0" distL="0" distR="0" hidden="0" layoutInCell="1" locked="0" relativeHeight="0" simplePos="0">
           <wp:simplePos x="0" y="0"/>
           <wp:positionH relativeFrom="column">
-            <wp:posOffset>-914399</wp:posOffset>
+            <wp:posOffset>-919162</wp:posOffset>
           </wp:positionH>
           <wp:positionV relativeFrom="paragraph">
             <wp:posOffset>-66674</wp:posOffset>
@@ -17642,7 +17644,7 @@
           <wp:extent cx="7781925" cy="95250"/>
           <wp:effectExtent b="0" l="0" r="0" t="0"/>
           <wp:wrapTopAndBottom distB="0" distT="0"/>
-          <wp:docPr descr="horizontal line" id="3" name="image1.png"/>
+          <wp:docPr descr="horizontal line" id="6" name="image1.png"/>
           <a:graphic>
             <a:graphicData uri="http://schemas.openxmlformats.org/drawingml/2006/picture">
               <pic:pic>
@@ -17690,7 +17692,7 @@
         <wp:inline distB="114300" distT="114300" distL="114300" distR="114300">
           <wp:extent cx="447675" cy="57150"/>
           <wp:effectExtent b="0" l="0" r="0" t="0"/>
-          <wp:docPr descr="short line" id="5" name="image2.png"/>
+          <wp:docPr descr="short line" id="4" name="image2.png"/>
           <a:graphic>
             <a:graphicData uri="http://schemas.openxmlformats.org/drawingml/2006/picture">
               <pic:pic>
@@ -18023,7 +18025,7 @@
           <wp:extent cx="7781925" cy="95250"/>
           <wp:effectExtent b="0" l="0" r="0" t="0"/>
           <wp:wrapTopAndBottom distB="0" distT="0"/>
-          <wp:docPr descr="horizontal line" id="4" name="image1.png"/>
+          <wp:docPr descr="horizontal line" id="5" name="image1.png"/>
           <a:graphic>
             <a:graphicData uri="http://schemas.openxmlformats.org/drawingml/2006/picture">
               <pic:pic>

</xml_diff>